<commit_message>
Correct student roll number in DataGuard report
</commit_message>
<xml_diff>
--- a/reports/DataGuard_Cloud_Computing_Report.docx
+++ b/reports/DataGuard_Cloud_Computing_Report.docx
@@ -479,7 +479,7 @@
                 <w:color w:val="FFFFFF"/>
                 <w:sz w:val="19"/>
               </w:rPr>
-              <w:t>Student ID</w:t>
+              <w:t>Roll number</w:t>
             </w:r>
           </w:p>
         </w:tc>
@@ -695,7 +695,7 @@
                 <w:color w:val="242F3B"/>
                 <w:sz w:val="19"/>
               </w:rPr>
-              <w:t>10657</w:t>
+              <w:t>10686</w:t>
             </w:r>
           </w:p>
         </w:tc>

</xml_diff>